<commit_message>
Polish Lab 2 report and validate diagrams
</commit_message>
<xml_diff>
--- a/docs/Lab2_Report.docx
+++ b/docs/Lab2_Report.docx
@@ -14,7 +14,7 @@
           <w:color w:val="000000"/>
           <w:sz w:val="24"/>
         </w:rPr>
-        <w:t>________________________________________</w:t>
+        <w:t>Заклад освіти: ____________________</w:t>
         <w:br/>
       </w:r>
       <w:r>
@@ -25,7 +25,7 @@
           <w:color w:val="000000"/>
           <w:sz w:val="24"/>
         </w:rPr>
-        <w:t>________________________________________</w:t>
+        <w:t>Кафедра: ____________________</w:t>
         <w:br/>
       </w:r>
     </w:p>
@@ -63,7 +63,7 @@
           <w:color w:val="000000"/>
           <w:sz w:val="32"/>
         </w:rPr>
-        <w:t>Проєктування веб системи</w:t>
+        <w:t>Проєктування вебсистеми</w:t>
         <w:br/>
       </w:r>
       <w:r>
@@ -74,7 +74,7 @@
           <w:color w:val="000000"/>
           <w:sz w:val="32"/>
         </w:rPr>
-        <w:t>Аналіз предметної галузі та побудова UML діаграм</w:t>
+        <w:t>Аналіз предметної галузі та побудова UML-діаграм</w:t>
       </w:r>
     </w:p>
     <w:p>
@@ -140,7 +140,7 @@
                 <w:color w:val="000000"/>
                 <w:sz w:val="24"/>
               </w:rPr>
-              <w:t>Виконав або виконала</w:t>
+              <w:t>Виконав</w:t>
             </w:r>
           </w:p>
         </w:tc>
@@ -166,7 +166,7 @@
                 <w:color w:val="000000"/>
                 <w:sz w:val="24"/>
               </w:rPr>
-              <w:t>________________________</w:t>
+              <w:t>________________</w:t>
             </w:r>
           </w:p>
         </w:tc>
@@ -220,7 +220,7 @@
                 <w:color w:val="000000"/>
                 <w:sz w:val="24"/>
               </w:rPr>
-              <w:t>________________________</w:t>
+              <w:t>________________</w:t>
             </w:r>
           </w:p>
         </w:tc>
@@ -248,7 +248,7 @@
                 <w:color w:val="000000"/>
                 <w:sz w:val="24"/>
               </w:rPr>
-              <w:t>Перевірив або перевірила</w:t>
+              <w:t>Перевірив</w:t>
             </w:r>
           </w:p>
         </w:tc>
@@ -274,7 +274,7 @@
                 <w:color w:val="000000"/>
                 <w:sz w:val="24"/>
               </w:rPr>
-              <w:t>________________________</w:t>
+              <w:t>________________</w:t>
             </w:r>
           </w:p>
         </w:tc>
@@ -668,6 +668,40 @@
           <w:sz w:val="28"/>
         </w:rPr>
         <w:t>3.2 Користувачі</w:t>
+      </w:r>
+    </w:p>
+    <w:p>
+      <w:pPr>
+        <w:spacing w:line="360" w:lineRule="auto" w:after="120"/>
+        <w:ind w:firstLine="709"/>
+        <w:jc w:val="both"/>
+      </w:pPr>
+      <w:r>
+        <w:rPr>
+          <w:rFonts w:ascii="Times New Roman" w:hAnsi="Times New Roman" w:eastAsia="Times New Roman"/>
+          <w:b w:val="0"/>
+          <w:i w:val="0"/>
+          <w:color w:val="000000"/>
+          <w:sz w:val="28"/>
+        </w:rPr>
+        <w:t>Ролі користувачів та їхні можливості наведено в таблиці 1.</w:t>
+      </w:r>
+    </w:p>
+    <w:p>
+      <w:pPr>
+        <w:keepNext/>
+        <w:spacing w:before="100" w:after="60"/>
+        <w:ind w:firstLine="709"/>
+      </w:pPr>
+      <w:r>
+        <w:rPr>
+          <w:rFonts w:ascii="Times New Roman" w:hAnsi="Times New Roman" w:eastAsia="Times New Roman"/>
+          <w:b w:val="0"/>
+          <w:i w:val="0"/>
+          <w:color w:val="000000"/>
+          <w:sz w:val="24"/>
+        </w:rPr>
+        <w:t>Таблиця 1 — Ролі користувачів системи</w:t>
       </w:r>
     </w:p>
     <w:tbl>
@@ -1270,6 +1304,40 @@
           <w:sz w:val="28"/>
         </w:rPr>
         <w:t>3.5 Логічні сутності та таблиці</w:t>
+      </w:r>
+    </w:p>
+    <w:p>
+      <w:pPr>
+        <w:spacing w:line="360" w:lineRule="auto" w:after="120"/>
+        <w:ind w:firstLine="709"/>
+        <w:jc w:val="both"/>
+      </w:pPr>
+      <w:r>
+        <w:rPr>
+          <w:rFonts w:ascii="Times New Roman" w:hAnsi="Times New Roman" w:eastAsia="Times New Roman"/>
+          <w:b w:val="0"/>
+          <w:i w:val="0"/>
+          <w:color w:val="000000"/>
+          <w:sz w:val="28"/>
+        </w:rPr>
+        <w:t>Основні логічні сутності та відповідні таблиці майбутньої бази даних подано в таблиці 2.</w:t>
+      </w:r>
+    </w:p>
+    <w:p>
+      <w:pPr>
+        <w:keepNext/>
+        <w:spacing w:before="100" w:after="60"/>
+        <w:ind w:firstLine="709"/>
+      </w:pPr>
+      <w:r>
+        <w:rPr>
+          <w:rFonts w:ascii="Times New Roman" w:hAnsi="Times New Roman" w:eastAsia="Times New Roman"/>
+          <w:b w:val="0"/>
+          <w:i w:val="0"/>
+          <w:color w:val="000000"/>
+          <w:sz w:val="24"/>
+        </w:rPr>
+        <w:t>Таблиця 2 — Логічні сутності та таблиці бази даних</w:t>
       </w:r>
     </w:p>
     <w:tbl>
@@ -2599,6 +2667,40 @@
         <w:t>4.3 Повна форма Придбати електронний квиток</w:t>
       </w:r>
     </w:p>
+    <w:p>
+      <w:pPr>
+        <w:spacing w:line="360" w:lineRule="auto" w:after="120"/>
+        <w:ind w:firstLine="709"/>
+        <w:jc w:val="both"/>
+      </w:pPr>
+      <w:r>
+        <w:rPr>
+          <w:rFonts w:ascii="Times New Roman" w:hAnsi="Times New Roman" w:eastAsia="Times New Roman"/>
+          <w:b w:val="0"/>
+          <w:i w:val="0"/>
+          <w:color w:val="000000"/>
+          <w:sz w:val="28"/>
+        </w:rPr>
+        <w:t>Характеристики повного варіанта використання наведено в таблиці 3.</w:t>
+      </w:r>
+    </w:p>
+    <w:p>
+      <w:pPr>
+        <w:keepNext/>
+        <w:spacing w:before="100" w:after="60"/>
+        <w:ind w:firstLine="709"/>
+      </w:pPr>
+      <w:r>
+        <w:rPr>
+          <w:rFonts w:ascii="Times New Roman" w:hAnsi="Times New Roman" w:eastAsia="Times New Roman"/>
+          <w:b w:val="0"/>
+          <w:i w:val="0"/>
+          <w:color w:val="000000"/>
+          <w:sz w:val="24"/>
+        </w:rPr>
+        <w:t>Таблиця 3 — Повний опис варіанта використання</w:t>
+      </w:r>
+    </w:p>
     <w:tbl>
       <w:tblPr>
         <w:tblW w:type="auto" w:w="0"/>
@@ -3148,7 +3250,7 @@
                 <w:color w:val="000000"/>
                 <w:sz w:val="21"/>
               </w:rPr>
-              <w:t>HTTPS; транзакційне резервування; ідемпотентна оплата; відповідь каталогу до 2 секунд за нормального навантаження; журналювання</w:t>
+              <w:t>HTTPS; транзакційне резервування; ідемпотентна оплата; цільова відповідь каталогу до 2 секунд за нормального навантаження; журналювання</w:t>
             </w:r>
           </w:p>
         </w:tc>
@@ -3266,7 +3368,7 @@
                 <w:color w:val="000000"/>
                 <w:sz w:val="21"/>
               </w:rPr>
-              <w:t>Висока, орієнтовно 60 відсотків цільових операцій</w:t>
+              <w:t>Проєктна оцінка: близько 60 відсотків цільових операцій; потребує перевірки після запуску</w:t>
             </w:r>
           </w:p>
         </w:tc>
@@ -3803,36 +3905,19 @@
           <w:color w:val="000000"/>
           <w:sz w:val="28"/>
         </w:rPr>
-        <w:t>Діаграма містить трьох акторів, щонайменше три дії для кожної ролі, асоціацію, узагальнення, include та extend.</w:t>
+        <w:t>Взаємодію трьох акторів із системою показано на рисунку 1. Діаграма містить асоціацію, узагальнення, include та extend. Вихідний код збережено у файлі use-case-diagram.puml.</w:t>
       </w:r>
     </w:p>
     <w:p>
       <w:pPr>
         <w:keepNext/>
-        <w:spacing w:after="100"/>
-        <w:ind w:firstLine="0"/>
-        <w:jc w:val="center"/>
-      </w:pPr>
-      <w:r>
-        <w:rPr>
-          <w:rFonts w:ascii="Times New Roman" w:hAnsi="Times New Roman" w:eastAsia="Times New Roman"/>
-          <w:b w:val="0"/>
-          <w:i/>
-          <w:color w:val="000000"/>
-          <w:sz w:val="24"/>
-        </w:rPr>
-        <w:t>Рисунок 1 Діаграма варіантів використання</w:t>
-      </w:r>
-    </w:p>
-    <w:p>
-      <w:pPr>
         <w:spacing w:after="0"/>
         <w:jc w:val="center"/>
       </w:pPr>
       <w:r>
         <w:drawing>
           <wp:inline xmlns:a="http://schemas.openxmlformats.org/drawingml/2006/main" xmlns:pic="http://schemas.openxmlformats.org/drawingml/2006/picture">
-            <wp:extent cx="5688000" cy="5669607"/>
+            <wp:extent cx="5220000" cy="4540771"/>
             <wp:docPr id="1" name="Picture 1"/>
             <wp:cNvGraphicFramePr>
               <a:graphicFrameLocks noChangeAspect="1"/>
@@ -3853,7 +3938,7 @@
                   <pic:spPr>
                     <a:xfrm>
                       <a:off x="0" y="0"/>
-                      <a:ext cx="5688000" cy="5669607"/>
+                      <a:ext cx="5220000" cy="4540771"/>
                     </a:xfrm>
                     <a:prstGeom prst="rect"/>
                   </pic:spPr>
@@ -3866,10 +3951,27 @@
     </w:p>
     <w:p>
       <w:pPr>
+        <w:spacing w:before="100" w:after="100"/>
+        <w:ind w:firstLine="0"/>
+        <w:jc w:val="center"/>
+      </w:pPr>
+      <w:r>
+        <w:rPr>
+          <w:rFonts w:ascii="Times New Roman" w:hAnsi="Times New Roman" w:eastAsia="Times New Roman"/>
+          <w:b w:val="0"/>
+          <w:i w:val="0"/>
+          <w:color w:val="000000"/>
+          <w:sz w:val="24"/>
+        </w:rPr>
+        <w:t>Рисунок 1 — Діаграма варіантів використання системи продажу квитків</w:t>
+      </w:r>
+    </w:p>
+    <w:p>
+      <w:pPr>
         <w:sectPr>
           <w:footerReference w:type="default" r:id="rId11"/>
           <w:pgSz w:w="16838" w:h="11906" w:orient="landscape"/>
-          <w:pgMar w:top="567" w:right="850" w:bottom="567" w:left="850" w:header="454" w:footer="454" w:gutter="0"/>
+          <w:pgMar w:top="1134" w:right="567" w:bottom="1134" w:left="1417" w:header="454" w:footer="454" w:gutter="0"/>
           <w:cols w:space="720"/>
           <w:titlePg/>
           <w:docGrid w:linePitch="360"/>
@@ -3897,31 +3999,31 @@
     </w:p>
     <w:p>
       <w:pPr>
-        <w:keepNext/>
-        <w:spacing w:after="100"/>
-        <w:ind w:firstLine="0"/>
-        <w:jc w:val="center"/>
+        <w:spacing w:line="360" w:lineRule="auto" w:after="120"/>
+        <w:ind w:firstLine="709"/>
+        <w:jc w:val="both"/>
       </w:pPr>
       <w:r>
         <w:rPr>
           <w:rFonts w:ascii="Times New Roman" w:hAnsi="Times New Roman" w:eastAsia="Times New Roman"/>
           <w:b w:val="0"/>
-          <w:i/>
+          <w:i w:val="0"/>
           <w:color w:val="000000"/>
-          <w:sz w:val="24"/>
+          <w:sz w:val="28"/>
         </w:rPr>
-        <w:t>Рисунок 2 Діаграма класів</w:t>
+        <w:t>Структуру десяти предметних класів і трьох контролерів показано на рисунку 2. Вихідний код діаграми збережено у файлі class-diagram.puml.</w:t>
       </w:r>
     </w:p>
     <w:p>
       <w:pPr>
+        <w:keepNext/>
         <w:spacing w:after="0"/>
         <w:jc w:val="center"/>
       </w:pPr>
       <w:r>
         <w:drawing>
           <wp:inline xmlns:a="http://schemas.openxmlformats.org/drawingml/2006/main" xmlns:pic="http://schemas.openxmlformats.org/drawingml/2006/picture">
-            <wp:extent cx="6660000" cy="5146062"/>
+            <wp:extent cx="10440000" cy="8066800"/>
             <wp:docPr id="2" name="Picture 2"/>
             <wp:cNvGraphicFramePr>
               <a:graphicFrameLocks noChangeAspect="1"/>
@@ -3942,7 +4044,7 @@
                   <pic:spPr>
                     <a:xfrm>
                       <a:off x="0" y="0"/>
-                      <a:ext cx="6660000" cy="5146062"/>
+                      <a:ext cx="10440000" cy="8066800"/>
                     </a:xfrm>
                     <a:prstGeom prst="rect"/>
                   </pic:spPr>
@@ -3955,10 +4057,27 @@
     </w:p>
     <w:p>
       <w:pPr>
+        <w:spacing w:before="100" w:after="100"/>
+        <w:ind w:firstLine="0"/>
+        <w:jc w:val="center"/>
+      </w:pPr>
+      <w:r>
+        <w:rPr>
+          <w:rFonts w:ascii="Times New Roman" w:hAnsi="Times New Roman" w:eastAsia="Times New Roman"/>
+          <w:b w:val="0"/>
+          <w:i w:val="0"/>
+          <w:color w:val="000000"/>
+          <w:sz w:val="24"/>
+        </w:rPr>
+        <w:t>Рисунок 2 — Діаграма класів системи продажу квитків</w:t>
+      </w:r>
+    </w:p>
+    <w:p>
+      <w:pPr>
         <w:sectPr>
           <w:footerReference w:type="default" r:id="rId13"/>
-          <w:pgSz w:w="16838" w:h="11906" w:orient="landscape"/>
-          <w:pgMar w:top="567" w:right="850" w:bottom="567" w:left="850" w:header="454" w:footer="454" w:gutter="0"/>
+          <w:pgSz w:w="23811" w:h="16838" w:orient="landscape"/>
+          <w:pgMar w:top="1134" w:right="567" w:bottom="1134" w:left="1417" w:header="454" w:footer="454" w:gutter="0"/>
           <w:cols w:space="720"/>
           <w:titlePg/>
           <w:docGrid w:linePitch="360"/>
@@ -3981,7 +4100,7 @@
           <w:color w:val="000000"/>
           <w:sz w:val="28"/>
         </w:rPr>
-        <w:t>7 Результати публікації</w:t>
+        <w:t>7 Перевірка та публікація</w:t>
       </w:r>
     </w:p>
     <w:p>
@@ -3998,7 +4117,7 @@
           <w:color w:val="000000"/>
           <w:sz w:val="28"/>
         </w:rPr>
-        <w:t>Архітектурний опис і вихідні файли PlantUML розміщено в репозиторії лабораторної роботи 1.</w:t>
+        <w:t>Матеріали розміщено у гілці feature/system-design репозиторію лабораторної роботи 1. Вихідні файли PlantUML дають змогу відтворити обидві схеми та перевірити проєктні рішення. Локальна перевірка scripts/validate-lab2.ps1 підтвердила три актори, тринадцять класів, шістнадцять кроків головного сценарію та вісім альтернативних сценаріїв; результат — LAB_2 VALIDATION: PASS.</w:t>
       </w:r>
     </w:p>
     <w:p>
@@ -4013,7 +4132,7 @@
           <w:color w:val="000000"/>
           <w:sz w:val="28"/>
         </w:rPr>
-        <w:t xml:space="preserve">Файл architecture.md: </w:t>
+        <w:t xml:space="preserve">Архітектурний опис: </w:t>
       </w:r>
       <w:hyperlink r:id="rId16">
         <w:r>
@@ -4022,7 +4141,32 @@
             <w:color w:val="1F4E78"/>
             <w:u w:val="single"/>
           </w:rPr>
-          <w:t>відкрити на GitHub</w:t>
+          <w:t>architecture.md у GitHub</w:t>
+        </w:r>
+      </w:hyperlink>
+    </w:p>
+    <w:p>
+      <w:pPr>
+        <w:spacing w:line="360" w:lineRule="auto" w:after="120"/>
+      </w:pPr>
+      <w:r>
+        <w:rPr>
+          <w:rFonts w:ascii="Times New Roman" w:hAnsi="Times New Roman" w:eastAsia="Times New Roman"/>
+          <w:b/>
+          <w:i w:val="0"/>
+          <w:color w:val="000000"/>
+          <w:sz w:val="28"/>
+        </w:rPr>
+        <w:t xml:space="preserve">Зафіксовані зміни: </w:t>
+      </w:r>
+      <w:hyperlink r:id="rId17">
+        <w:r>
+          <w:rPr>
+            <w:rFonts w:ascii="Times New Roman" w:hAnsi="Times New Roman"/>
+            <w:color w:val="1F4E78"/>
+            <w:u w:val="single"/>
+          </w:rPr>
+          <w:t>коміт e6a5dae</w:t>
         </w:r>
       </w:hyperlink>
     </w:p>
@@ -4044,11 +4188,11 @@
         <w:rPr>
           <w:rFonts w:ascii="Times New Roman" w:hAnsi="Times New Roman" w:eastAsia="Times New Roman"/>
           <w:b w:val="0"/>
-          <w:i/>
+          <w:i w:val="0"/>
           <w:color w:val="000000"/>
           <w:sz w:val="28"/>
         </w:rPr>
-        <w:t>посилання буде додано після створення Pull Request</w:t>
+        <w:t>ще не створено; підключення GitHub відхилило дію через обмеження прав інтеграції</w:t>
       </w:r>
     </w:p>
     <w:p>
@@ -4067,7 +4211,7 @@
           <w:color w:val="000000"/>
           <w:sz w:val="28"/>
         </w:rPr>
-        <w:t>8 Висновок</w:t>
+        <w:t>ВИСНОВКИ</w:t>
       </w:r>
     </w:p>
     <w:p>
@@ -4086,6 +4230,68 @@
         </w:rPr>
         <w:t>У роботі визначено призначення, функції, ролі, сценарії та структуру даних електронної системи продажу квитків до кінотеатру. Три форми Use Case описують основні дії користувачів, а UML-діаграми задають поведінкову й структурну модель майбутнього застосунку. Запроєктовані моделі та контролери можна безпосередньо використати як основу для Eloquent-моделей, міграцій, маршрутів і контролерів Laravel. Транзакційне блокування місць та ідемпотентна обробка платежів запобігають подвійним продажам і повторному списанню коштів.</w:t>
       </w:r>
+    </w:p>
+    <w:p>
+      <w:pPr>
+        <w:pStyle w:val="Heading1"/>
+        <w:keepNext/>
+        <w:spacing w:before="240" w:after="120"/>
+        <w:ind w:firstLine="0"/>
+        <w:jc w:val="left"/>
+      </w:pPr>
+      <w:r>
+        <w:rPr>
+          <w:rFonts w:ascii="Times New Roman" w:hAnsi="Times New Roman" w:eastAsia="Times New Roman"/>
+          <w:b/>
+          <w:i w:val="0"/>
+          <w:color w:val="000000"/>
+          <w:sz w:val="28"/>
+        </w:rPr>
+        <w:t>ПЕРЕЛІК ДЖЕРЕЛ ПОСИЛАННЯ</w:t>
+      </w:r>
+    </w:p>
+    <w:p>
+      <w:pPr>
+        <w:spacing w:line="360" w:lineRule="auto" w:after="120"/>
+        <w:ind w:firstLine="709"/>
+        <w:jc w:val="both"/>
+      </w:pPr>
+      <w:r>
+        <w:rPr>
+          <w:rFonts w:ascii="Times New Roman" w:hAnsi="Times New Roman" w:eastAsia="Times New Roman"/>
+          <w:b w:val="0"/>
+          <w:i w:val="0"/>
+          <w:color w:val="000000"/>
+          <w:sz w:val="28"/>
+        </w:rPr>
+        <w:t>1. Лабораторна робота 2. Проєктування вебсистеми: аналіз предметної галузі, побудова діаграм варіантів використання та класів. Методичні матеріали до дисципліни «Вебпрограмування». 22 с.</w:t>
+      </w:r>
+    </w:p>
+    <w:p>
+      <w:pPr>
+        <w:spacing w:line="360" w:lineRule="auto" w:after="120"/>
+        <w:ind w:firstLine="709"/>
+      </w:pPr>
+      <w:r>
+        <w:rPr>
+          <w:rFonts w:ascii="Times New Roman" w:hAnsi="Times New Roman" w:eastAsia="Times New Roman"/>
+          <w:b w:val="0"/>
+          <w:i w:val="0"/>
+          <w:color w:val="000000"/>
+          <w:sz w:val="28"/>
+        </w:rPr>
+        <w:t xml:space="preserve">2. ДСТУ 3008:2015. Інформація та документація. Звіти у сфері науки і техніки. Структура та правила оформлювання. Київ: ДП «УкрНДНЦ», 2016. </w:t>
+      </w:r>
+      <w:hyperlink r:id="rId18">
+        <w:r>
+          <w:rPr>
+            <w:rFonts w:ascii="Times New Roman" w:hAnsi="Times New Roman"/>
+            <w:color w:val="1F4E78"/>
+            <w:u w:val="single"/>
+          </w:rPr>
+          <w:t>Електронна копія</w:t>
+        </w:r>
+      </w:hyperlink>
     </w:p>
     <w:sectPr>
       <w:footerReference w:type="default" r:id="rId15"/>

</xml_diff>

<commit_message>
Fit UML figures within report pages
</commit_message>
<xml_diff>
--- a/docs/Lab2_Report.docx
+++ b/docs/Lab2_Report.docx
@@ -3917,7 +3917,7 @@
       <w:r>
         <w:drawing>
           <wp:inline xmlns:a="http://schemas.openxmlformats.org/drawingml/2006/main" xmlns:pic="http://schemas.openxmlformats.org/drawingml/2006/picture">
-            <wp:extent cx="5220000" cy="4540771"/>
+            <wp:extent cx="4759279" cy="4139999"/>
             <wp:docPr id="1" name="Picture 1"/>
             <wp:cNvGraphicFramePr>
               <a:graphicFrameLocks noChangeAspect="1"/>
@@ -3938,7 +3938,7 @@
                   <pic:spPr>
                     <a:xfrm>
                       <a:off x="0" y="0"/>
-                      <a:ext cx="5220000" cy="4540771"/>
+                      <a:ext cx="4759279" cy="4139999"/>
                     </a:xfrm>
                     <a:prstGeom prst="rect"/>
                   </pic:spPr>
@@ -4023,7 +4023,7 @@
       <w:r>
         <w:drawing>
           <wp:inline xmlns:a="http://schemas.openxmlformats.org/drawingml/2006/main" xmlns:pic="http://schemas.openxmlformats.org/drawingml/2006/picture">
-            <wp:extent cx="10440000" cy="8066800"/>
+            <wp:extent cx="9318193" cy="7200000"/>
             <wp:docPr id="2" name="Picture 2"/>
             <wp:cNvGraphicFramePr>
               <a:graphicFrameLocks noChangeAspect="1"/>
@@ -4044,7 +4044,7 @@
                   <pic:spPr>
                     <a:xfrm>
                       <a:off x="0" y="0"/>
-                      <a:ext cx="10440000" cy="8066800"/>
+                      <a:ext cx="9318193" cy="7200000"/>
                     </a:xfrm>
                     <a:prstGeom prst="rect"/>
                   </pic:spPr>

</xml_diff>

<commit_message>
Use consistent page size for UML figures
</commit_message>
<xml_diff>
--- a/docs/Lab2_Report.docx
+++ b/docs/Lab2_Report.docx
@@ -3917,7 +3917,7 @@
       <w:r>
         <w:drawing>
           <wp:inline xmlns:a="http://schemas.openxmlformats.org/drawingml/2006/main" xmlns:pic="http://schemas.openxmlformats.org/drawingml/2006/picture">
-            <wp:extent cx="4759279" cy="4139999"/>
+            <wp:extent cx="7200000" cy="6263133"/>
             <wp:docPr id="1" name="Picture 1"/>
             <wp:cNvGraphicFramePr>
               <a:graphicFrameLocks noChangeAspect="1"/>
@@ -3938,7 +3938,7 @@
                   <pic:spPr>
                     <a:xfrm>
                       <a:off x="0" y="0"/>
-                      <a:ext cx="4759279" cy="4139999"/>
+                      <a:ext cx="7200000" cy="6263133"/>
                     </a:xfrm>
                     <a:prstGeom prst="rect"/>
                   </pic:spPr>
@@ -3970,7 +3970,7 @@
       <w:pPr>
         <w:sectPr>
           <w:footerReference w:type="default" r:id="rId11"/>
-          <w:pgSz w:w="16838" w:h="11906" w:orient="landscape"/>
+          <w:pgSz w:w="23811" w:h="16838" w:orient="landscape"/>
           <w:pgMar w:top="1134" w:right="567" w:bottom="1134" w:left="1417" w:header="454" w:footer="454" w:gutter="0"/>
           <w:cols w:space="720"/>
           <w:titlePg/>

</xml_diff>